<commit_message>
Add is_signed and is_archived columns to acceptance_acts table</message>
<message>
- Introduced new columns "is_signed" and "is_archived" in the acceptance_acts table to enhance tracking of acceptance act statuses.
- Updated SQL migration files to reflect these changes and ensure proper default values.
- Enhanced metadata in journal and snapshot files to maintain versioning consistency.
- Improved acceptance act management by allowing better categorization and filtering based on signing and archiving status.
</commit_message>
<xml_diff>
--- a/forms/act-service.docx
+++ b/forms/act-service.docx
@@ -11,7 +11,7 @@
         <w:rPr>
           <w:b/>
           <w:bCs/>
-          <w:lang w:val="en-US"/>
+          <w:lang w:val="uk-UA"/>
         </w:rPr>
       </w:pPr>
       <w:r>
@@ -28,9 +28,27 @@
         <w:rPr>
           <w:b/>
           <w:bCs/>
-          <w:lang w:val="en-US"/>
-        </w:rPr>
-        <w:t>{act-number}</w:t>
+          <w:lang w:val="uk-UA"/>
+        </w:rPr>
+        <w:t>{</w:t>
+      </w:r>
+      <w:proofErr w:type="spellStart"/>
+      <w:r>
+        <w:rPr>
+          <w:b/>
+          <w:bCs/>
+          <w:lang w:val="uk-UA"/>
+        </w:rPr>
+        <w:t>act-number</w:t>
+      </w:r>
+      <w:proofErr w:type="spellEnd"/>
+      <w:r>
+        <w:rPr>
+          <w:b/>
+          <w:bCs/>
+          <w:lang w:val="uk-UA"/>
+        </w:rPr>
+        <w:t>}</w:t>
       </w:r>
     </w:p>
     <w:p>
@@ -41,7 +59,7 @@
         <w:rPr>
           <w:b/>
           <w:bCs/>
-          <w:lang w:val="en-US"/>
+          <w:lang w:val="uk-UA"/>
         </w:rPr>
       </w:pPr>
       <w:r>
@@ -50,31 +68,7 @@
           <w:bCs/>
           <w:lang w:val="uk-UA"/>
         </w:rPr>
-        <w:t>при</w:t>
-      </w:r>
-      <w:r>
-        <w:rPr>
-          <w:b/>
-          <w:bCs/>
-          <w:lang w:val="uk-UA"/>
-        </w:rPr>
-        <w:t>ймання</w:t>
-      </w:r>
-      <w:r>
-        <w:rPr>
-          <w:b/>
-          <w:bCs/>
-          <w:lang w:val="uk-UA"/>
-        </w:rPr>
-        <w:t>-</w:t>
-      </w:r>
-      <w:r>
-        <w:rPr>
-          <w:b/>
-          <w:bCs/>
-          <w:lang w:val="uk-UA"/>
-        </w:rPr>
-        <w:t>здачі</w:t>
+        <w:t>приймання-здачі</w:t>
       </w:r>
       <w:r>
         <w:rPr>
@@ -115,16 +109,34 @@
               <w:rPr>
                 <w:b/>
                 <w:bCs/>
-                <w:lang w:val="en-US"/>
-              </w:rPr>
-            </w:pPr>
-            <w:r>
-              <w:rPr>
-                <w:b/>
-                <w:bCs/>
-                <w:lang w:val="en-US"/>
-              </w:rPr>
-              <w:t>{act-place}</w:t>
+                <w:lang w:val="uk-UA"/>
+              </w:rPr>
+            </w:pPr>
+            <w:r>
+              <w:rPr>
+                <w:b/>
+                <w:bCs/>
+                <w:lang w:val="uk-UA"/>
+              </w:rPr>
+              <w:t>{</w:t>
+            </w:r>
+            <w:proofErr w:type="spellStart"/>
+            <w:r>
+              <w:rPr>
+                <w:b/>
+                <w:bCs/>
+                <w:lang w:val="uk-UA"/>
+              </w:rPr>
+              <w:t>act-place</w:t>
+            </w:r>
+            <w:proofErr w:type="spellEnd"/>
+            <w:r>
+              <w:rPr>
+                <w:b/>
+                <w:bCs/>
+                <w:lang w:val="uk-UA"/>
+              </w:rPr>
+              <w:t>}</w:t>
             </w:r>
             <w:bookmarkStart w:id="1" w:name="Mesiac"/>
             <w:bookmarkStart w:id="2" w:name="God"/>
@@ -134,7 +146,7 @@
               <w:rPr>
                 <w:b/>
                 <w:bCs/>
-                <w:lang w:val="en-US"/>
+                <w:lang w:val="uk-UA"/>
               </w:rPr>
               <w:tab/>
             </w:r>
@@ -152,16 +164,34 @@
               <w:rPr>
                 <w:b/>
                 <w:bCs/>
-                <w:lang w:val="en-US"/>
-              </w:rPr>
-            </w:pPr>
-            <w:r>
-              <w:rPr>
-                <w:b/>
-                <w:bCs/>
-                <w:lang w:val="en-US"/>
-              </w:rPr>
-              <w:t>{act-date}</w:t>
+                <w:lang w:val="uk-UA"/>
+              </w:rPr>
+            </w:pPr>
+            <w:r>
+              <w:rPr>
+                <w:b/>
+                <w:bCs/>
+                <w:lang w:val="uk-UA"/>
+              </w:rPr>
+              <w:t>{</w:t>
+            </w:r>
+            <w:proofErr w:type="spellStart"/>
+            <w:r>
+              <w:rPr>
+                <w:b/>
+                <w:bCs/>
+                <w:lang w:val="uk-UA"/>
+              </w:rPr>
+              <w:t>act-date</w:t>
+            </w:r>
+            <w:proofErr w:type="spellEnd"/>
+            <w:r>
+              <w:rPr>
+                <w:b/>
+                <w:bCs/>
+                <w:lang w:val="uk-UA"/>
+              </w:rPr>
+              <w:t>}</w:t>
             </w:r>
           </w:p>
         </w:tc>
@@ -194,37 +224,7 @@
         <w:rPr>
           <w:lang w:val="uk-UA"/>
         </w:rPr>
-        <w:t>Цей</w:t>
-      </w:r>
-      <w:r>
-        <w:rPr>
-          <w:lang w:val="uk-UA"/>
-        </w:rPr>
-        <w:t xml:space="preserve"> акт </w:t>
-      </w:r>
-      <w:r>
-        <w:rPr>
-          <w:lang w:val="uk-UA"/>
-        </w:rPr>
-        <w:t>склали</w:t>
-      </w:r>
-      <w:r>
-        <w:rPr>
-          <w:lang w:val="uk-UA"/>
-        </w:rPr>
-        <w:t xml:space="preserve">: </w:t>
-      </w:r>
-      <w:r>
-        <w:rPr>
-          <w:lang w:val="uk-UA"/>
-        </w:rPr>
-        <w:t>Представник</w:t>
-      </w:r>
-      <w:r>
-        <w:rPr>
-          <w:lang w:val="uk-UA"/>
-        </w:rPr>
-        <w:t xml:space="preserve"> «</w:t>
+        <w:t>Цей акт склали: Представник «</w:t>
       </w:r>
       <w:r>
         <w:rPr>
@@ -255,46 +255,24 @@
         </w:rPr>
         <w:t>{</w:t>
       </w:r>
-      <w:r>
-        <w:rPr>
-          <w:b/>
-          <w:bCs/>
-          <w:lang w:val="en-US"/>
-        </w:rPr>
-        <w:t>act</w:t>
-      </w:r>
-      <w:r>
-        <w:rPr>
-          <w:b/>
-          <w:bCs/>
-          <w:lang w:val="uk-UA"/>
-        </w:rPr>
-        <w:t>-</w:t>
-      </w:r>
-      <w:r>
-        <w:rPr>
-          <w:b/>
-          <w:bCs/>
-          <w:lang w:val="en-US"/>
-        </w:rPr>
-        <w:t>header</w:t>
-      </w:r>
-      <w:r>
-        <w:rPr>
-          <w:b/>
-          <w:bCs/>
-          <w:lang w:val="uk-UA"/>
-        </w:rPr>
-        <w:t>-</w:t>
-      </w:r>
-      <w:r>
-        <w:rPr>
-          <w:b/>
-          <w:bCs/>
-          <w:lang w:val="en-US"/>
+      <w:proofErr w:type="spellStart"/>
+      <w:r>
+        <w:rPr>
+          <w:b/>
+          <w:bCs/>
+          <w:lang w:val="uk-UA"/>
+        </w:rPr>
+        <w:t>act-header-</w:t>
+      </w:r>
+      <w:r>
+        <w:rPr>
+          <w:b/>
+          <w:bCs/>
+          <w:lang w:val="uk-UA"/>
         </w:rPr>
         <w:t>contractor</w:t>
       </w:r>
+      <w:proofErr w:type="spellEnd"/>
       <w:r>
         <w:rPr>
           <w:b/>
@@ -317,49 +295,7 @@
         <w:rPr>
           <w:lang w:val="uk-UA"/>
         </w:rPr>
-        <w:t>з</w:t>
-      </w:r>
-      <w:r>
-        <w:rPr>
-          <w:lang w:val="uk-UA"/>
-        </w:rPr>
-        <w:t xml:space="preserve"> одн</w:t>
-      </w:r>
-      <w:r>
-        <w:rPr>
-          <w:lang w:val="uk-UA"/>
-        </w:rPr>
-        <w:t>ієї сторони</w:t>
-      </w:r>
-      <w:r>
-        <w:rPr>
-          <w:lang w:val="uk-UA"/>
-        </w:rPr>
-        <w:t xml:space="preserve"> </w:t>
-      </w:r>
-      <w:r>
-        <w:rPr>
-          <w:lang w:val="uk-UA"/>
-        </w:rPr>
-        <w:t>та</w:t>
-      </w:r>
-      <w:r>
-        <w:rPr>
-          <w:lang w:val="uk-UA"/>
-        </w:rPr>
-        <w:t xml:space="preserve"> представ</w:t>
-      </w:r>
-      <w:r>
-        <w:rPr>
-          <w:lang w:val="uk-UA"/>
-        </w:rPr>
-        <w:t>ник</w:t>
-      </w:r>
-      <w:r>
-        <w:rPr>
-          <w:lang w:val="uk-UA"/>
-        </w:rPr>
-        <w:t xml:space="preserve"> «</w:t>
+        <w:t>з однієї сторони та представник «</w:t>
       </w:r>
       <w:r>
         <w:rPr>
@@ -392,46 +328,32 @@
         </w:rPr>
         <w:t>{</w:t>
       </w:r>
-      <w:r>
-        <w:rPr>
-          <w:b/>
-          <w:bCs/>
-          <w:lang w:val="en-US"/>
-        </w:rPr>
-        <w:t>act</w:t>
-      </w:r>
-      <w:r>
-        <w:rPr>
-          <w:b/>
-          <w:bCs/>
-          <w:lang w:val="uk-UA"/>
-        </w:rPr>
-        <w:t>-</w:t>
-      </w:r>
-      <w:r>
-        <w:rPr>
-          <w:b/>
-          <w:bCs/>
-          <w:lang w:val="en-US"/>
-        </w:rPr>
-        <w:t>header</w:t>
-      </w:r>
-      <w:r>
-        <w:rPr>
-          <w:b/>
-          <w:bCs/>
-          <w:lang w:val="uk-UA"/>
-        </w:rPr>
-        <w:t>-</w:t>
-      </w:r>
-      <w:r>
-        <w:rPr>
-          <w:b/>
-          <w:bCs/>
-          <w:lang w:val="en-US"/>
+      <w:proofErr w:type="spellStart"/>
+      <w:r>
+        <w:rPr>
+          <w:b/>
+          <w:bCs/>
+          <w:lang w:val="uk-UA"/>
+        </w:rPr>
+        <w:t>act-</w:t>
+      </w:r>
+      <w:r>
+        <w:rPr>
+          <w:b/>
+          <w:bCs/>
+          <w:lang w:val="uk-UA"/>
+        </w:rPr>
+        <w:t>header-</w:t>
+      </w:r>
+      <w:r>
+        <w:rPr>
+          <w:b/>
+          <w:bCs/>
+          <w:lang w:val="uk-UA"/>
         </w:rPr>
         <w:t>customer</w:t>
       </w:r>
+      <w:proofErr w:type="spellEnd"/>
       <w:r>
         <w:rPr>
           <w:b/>
@@ -450,106 +372,42 @@
         <w:rPr>
           <w:lang w:val="uk-UA"/>
         </w:rPr>
+        <w:t>з другої сторони в том, що у відповідності</w:t>
+      </w:r>
+      <w:r>
+        <w:rPr>
+          <w:lang w:val="uk-UA"/>
+        </w:rPr>
+        <w:t xml:space="preserve"> </w:t>
+      </w:r>
+      <w:r>
+        <w:rPr>
+          <w:lang w:val="uk-UA"/>
+        </w:rPr>
         <w:t>з</w:t>
       </w:r>
       <w:r>
         <w:rPr>
-          <w:lang w:val="uk-UA"/>
-        </w:rPr>
-        <w:t xml:space="preserve"> друго</w:t>
-      </w:r>
-      <w:r>
-        <w:rPr>
-          <w:lang w:val="uk-UA"/>
-        </w:rPr>
-        <w:t>ї</w:t>
-      </w:r>
-      <w:r>
-        <w:rPr>
-          <w:lang w:val="uk-UA"/>
-        </w:rPr>
-        <w:t xml:space="preserve"> сторон</w:t>
-      </w:r>
-      <w:r>
-        <w:rPr>
-          <w:lang w:val="uk-UA"/>
-        </w:rPr>
-        <w:t>и</w:t>
-      </w:r>
-      <w:r>
-        <w:rPr>
-          <w:lang w:val="uk-UA"/>
-        </w:rPr>
-        <w:t xml:space="preserve"> в том, </w:t>
-      </w:r>
-      <w:r>
-        <w:rPr>
-          <w:lang w:val="uk-UA"/>
-        </w:rPr>
-        <w:t>щ</w:t>
-      </w:r>
-      <w:r>
-        <w:rPr>
-          <w:lang w:val="uk-UA"/>
-        </w:rPr>
-        <w:t xml:space="preserve">о </w:t>
-      </w:r>
-      <w:r>
-        <w:rPr>
-          <w:lang w:val="uk-UA"/>
-        </w:rPr>
-        <w:t>у</w:t>
-      </w:r>
-      <w:r>
-        <w:rPr>
-          <w:lang w:val="uk-UA"/>
-        </w:rPr>
-        <w:t xml:space="preserve"> </w:t>
-      </w:r>
-      <w:r>
-        <w:rPr>
-          <w:lang w:val="uk-UA"/>
-        </w:rPr>
-        <w:t>відповідності</w:t>
-      </w:r>
-      <w:r>
-        <w:rPr>
-          <w:lang w:val="uk-UA"/>
-        </w:rPr>
-        <w:t xml:space="preserve"> </w:t>
-      </w:r>
-      <w:r>
-        <w:rPr>
-          <w:lang w:val="uk-UA"/>
-        </w:rPr>
-        <w:t>з</w:t>
-      </w:r>
-      <w:r>
-        <w:rPr>
+          <w:b/>
+          <w:bCs/>
           <w:lang w:val="uk-UA"/>
         </w:rPr>
         <w:t>{</w:t>
       </w:r>
-      <w:r>
-        <w:rPr>
-          <w:lang w:val="en-US"/>
-        </w:rPr>
-        <w:t>act</w:t>
-      </w:r>
-      <w:r>
-        <w:rPr>
-          <w:lang w:val="uk-UA"/>
-        </w:rPr>
-        <w:t>-</w:t>
-      </w:r>
-      <w:r>
-        <w:rPr>
-          <w:lang w:val="en-US"/>
-        </w:rPr>
-        <w:t>treaty</w:t>
-      </w:r>
-      <w:r>
-        <w:rPr>
+      <w:proofErr w:type="spellStart"/>
+      <w:r>
+        <w:rPr>
+          <w:b/>
+          <w:bCs/>
+          <w:lang w:val="uk-UA"/>
+        </w:rPr>
+        <w:t>act-treaty</w:t>
+      </w:r>
+      <w:proofErr w:type="spellEnd"/>
+      <w:r>
+        <w:rPr>
+          <w:b/>
+          <w:bCs/>
           <w:lang w:val="uk-UA"/>
         </w:rPr>
         <w:t>}</w:t>
@@ -580,46 +438,16 @@
         </w:rPr>
         <w:t>{</w:t>
       </w:r>
-      <w:r>
-        <w:rPr>
-          <w:b/>
-          <w:bCs/>
-          <w:lang w:val="en-US"/>
-        </w:rPr>
-        <w:t>act</w:t>
-      </w:r>
-      <w:r>
-        <w:rPr>
-          <w:b/>
-          <w:bCs/>
-          <w:lang w:val="uk-UA"/>
-        </w:rPr>
-        <w:t>-</w:t>
-      </w:r>
-      <w:r>
-        <w:rPr>
-          <w:b/>
-          <w:bCs/>
-          <w:lang w:val="en-US"/>
-        </w:rPr>
-        <w:t>treaty</w:t>
-      </w:r>
-      <w:r>
-        <w:rPr>
-          <w:b/>
-          <w:bCs/>
-          <w:lang w:val="uk-UA"/>
-        </w:rPr>
-        <w:t>-</w:t>
-      </w:r>
-      <w:r>
-        <w:rPr>
-          <w:b/>
-          <w:bCs/>
-          <w:lang w:val="en-US"/>
-        </w:rPr>
-        <w:t>number</w:t>
-      </w:r>
+      <w:proofErr w:type="spellStart"/>
+      <w:r>
+        <w:rPr>
+          <w:b/>
+          <w:bCs/>
+          <w:lang w:val="uk-UA"/>
+        </w:rPr>
+        <w:t>act-treaty-number</w:t>
+      </w:r>
+      <w:proofErr w:type="spellEnd"/>
       <w:r>
         <w:rPr>
           <w:b/>
@@ -650,46 +478,16 @@
         </w:rPr>
         <w:t>{</w:t>
       </w:r>
-      <w:r>
-        <w:rPr>
-          <w:b/>
-          <w:bCs/>
-          <w:lang w:val="en-US"/>
-        </w:rPr>
-        <w:t>act</w:t>
-      </w:r>
-      <w:r>
-        <w:rPr>
-          <w:b/>
-          <w:bCs/>
-          <w:lang w:val="uk-UA"/>
-        </w:rPr>
-        <w:t>-</w:t>
-      </w:r>
-      <w:r>
-        <w:rPr>
-          <w:b/>
-          <w:bCs/>
-          <w:lang w:val="en-US"/>
-        </w:rPr>
-        <w:t>treaty</w:t>
-      </w:r>
-      <w:r>
-        <w:rPr>
-          <w:b/>
-          <w:bCs/>
-          <w:lang w:val="uk-UA"/>
-        </w:rPr>
-        <w:t>-</w:t>
-      </w:r>
-      <w:r>
-        <w:rPr>
-          <w:b/>
-          <w:bCs/>
-          <w:lang w:val="en-US"/>
-        </w:rPr>
-        <w:t>date</w:t>
-      </w:r>
+      <w:proofErr w:type="spellStart"/>
+      <w:r>
+        <w:rPr>
+          <w:b/>
+          <w:bCs/>
+          <w:lang w:val="uk-UA"/>
+        </w:rPr>
+        <w:t>act-treaty-date</w:t>
+      </w:r>
+      <w:proofErr w:type="spellEnd"/>
       <w:r>
         <w:rPr>
           <w:b/>
@@ -808,7 +606,7 @@
               <w:spacing w:line="276" w:lineRule="auto"/>
               <w:jc w:val="center"/>
               <w:rPr>
-                <w:lang w:val="en-US"/>
+                <w:lang w:val="uk-UA"/>
               </w:rPr>
             </w:pPr>
             <w:r>
@@ -819,7 +617,7 @@
             </w:r>
             <w:r>
               <w:rPr>
-                <w:lang w:val="en-US"/>
+                <w:lang w:val="uk-UA"/>
               </w:rPr>
               <w:t xml:space="preserve"> </w:t>
             </w:r>
@@ -961,34 +759,20 @@
               <w:spacing w:line="276" w:lineRule="auto"/>
               <w:jc w:val="center"/>
               <w:rPr>
-                <w:lang w:val="en-US"/>
-              </w:rPr>
-            </w:pPr>
-            <w:r>
-              <w:rPr>
-                <w:lang w:val="en-US"/>
-              </w:rPr>
-              <w:t>{#</w:t>
-            </w:r>
-            <w:proofErr w:type="gramStart"/>
-            <w:r>
-              <w:rPr>
-                <w:lang w:val="en-US"/>
-              </w:rPr>
-              <w:t>items}</w:t>
-            </w:r>
-            <w:r>
-              <w:rPr>
-                <w:lang w:val="en-US"/>
-              </w:rPr>
-              <w:t>{</w:t>
-            </w:r>
-            <w:proofErr w:type="gramEnd"/>
-            <w:r>
-              <w:rPr>
-                <w:lang w:val="en-US"/>
-              </w:rPr>
-              <w:t>act-job-item-number}</w:t>
+                <w:lang w:val="uk-UA"/>
+              </w:rPr>
+            </w:pPr>
+            <w:r>
+              <w:rPr>
+                <w:lang w:val="uk-UA"/>
+              </w:rPr>
+              <w:t>{#items}</w:t>
+            </w:r>
+            <w:r>
+              <w:rPr>
+                <w:lang w:val="uk-UA"/>
+              </w:rPr>
+              <w:t>{act-job-item-number}</w:t>
             </w:r>
           </w:p>
         </w:tc>
@@ -1006,9 +790,23 @@
             </w:pPr>
             <w:r>
               <w:rPr>
-                <w:lang w:val="en-US"/>
-              </w:rPr>
-              <w:t>{act-job-item-title}</w:t>
+                <w:lang w:val="uk-UA"/>
+              </w:rPr>
+              <w:t>{</w:t>
+            </w:r>
+            <w:proofErr w:type="spellStart"/>
+            <w:r>
+              <w:rPr>
+                <w:lang w:val="uk-UA"/>
+              </w:rPr>
+              <w:t>act-job-item-title</w:t>
+            </w:r>
+            <w:proofErr w:type="spellEnd"/>
+            <w:r>
+              <w:rPr>
+                <w:lang w:val="uk-UA"/>
+              </w:rPr>
+              <w:t>}</w:t>
             </w:r>
           </w:p>
         </w:tc>
@@ -1027,9 +825,23 @@
             </w:pPr>
             <w:r>
               <w:rPr>
-                <w:lang w:val="en-US"/>
-              </w:rPr>
-              <w:t>{act-job-item-unit}</w:t>
+                <w:lang w:val="uk-UA"/>
+              </w:rPr>
+              <w:t>{</w:t>
+            </w:r>
+            <w:proofErr w:type="spellStart"/>
+            <w:r>
+              <w:rPr>
+                <w:lang w:val="uk-UA"/>
+              </w:rPr>
+              <w:t>act-job-item-unit</w:t>
+            </w:r>
+            <w:proofErr w:type="spellEnd"/>
+            <w:r>
+              <w:rPr>
+                <w:lang w:val="uk-UA"/>
+              </w:rPr>
+              <w:t>}</w:t>
             </w:r>
           </w:p>
         </w:tc>
@@ -1048,9 +860,23 @@
             </w:pPr>
             <w:r>
               <w:rPr>
-                <w:lang w:val="en-US"/>
-              </w:rPr>
-              <w:t>{act-job-item-quantity}</w:t>
+                <w:lang w:val="uk-UA"/>
+              </w:rPr>
+              <w:t>{</w:t>
+            </w:r>
+            <w:proofErr w:type="spellStart"/>
+            <w:r>
+              <w:rPr>
+                <w:lang w:val="uk-UA"/>
+              </w:rPr>
+              <w:t>act-job-item-quantity</w:t>
+            </w:r>
+            <w:proofErr w:type="spellEnd"/>
+            <w:r>
+              <w:rPr>
+                <w:lang w:val="uk-UA"/>
+              </w:rPr>
+              <w:t>}</w:t>
             </w:r>
           </w:p>
         </w:tc>
@@ -1069,9 +895,23 @@
             </w:pPr>
             <w:r>
               <w:rPr>
-                <w:lang w:val="en-US"/>
-              </w:rPr>
-              <w:t>{act-job-item-price}</w:t>
+                <w:lang w:val="uk-UA"/>
+              </w:rPr>
+              <w:t>{</w:t>
+            </w:r>
+            <w:proofErr w:type="spellStart"/>
+            <w:r>
+              <w:rPr>
+                <w:lang w:val="uk-UA"/>
+              </w:rPr>
+              <w:t>act-job-item-price</w:t>
+            </w:r>
+            <w:proofErr w:type="spellEnd"/>
+            <w:r>
+              <w:rPr>
+                <w:lang w:val="uk-UA"/>
+              </w:rPr>
+              <w:t>}</w:t>
             </w:r>
           </w:p>
         </w:tc>
@@ -1085,34 +925,48 @@
               <w:spacing w:line="276" w:lineRule="auto"/>
               <w:jc w:val="center"/>
               <w:rPr>
-                <w:lang w:val="en-US"/>
-              </w:rPr>
-            </w:pPr>
-            <w:r>
-              <w:rPr>
-                <w:lang w:val="en-US"/>
-              </w:rPr>
-              <w:t>{act-job-item-total-</w:t>
-            </w:r>
-            <w:proofErr w:type="gramStart"/>
-            <w:r>
-              <w:rPr>
-                <w:lang w:val="en-US"/>
-              </w:rPr>
-              <w:t>price}</w:t>
-            </w:r>
-            <w:r>
-              <w:rPr>
-                <w:lang w:val="en-US"/>
+                <w:lang w:val="uk-UA"/>
+              </w:rPr>
+            </w:pPr>
+            <w:r>
+              <w:rPr>
+                <w:lang w:val="uk-UA"/>
               </w:rPr>
               <w:t>{</w:t>
             </w:r>
-            <w:proofErr w:type="gramEnd"/>
-            <w:r>
-              <w:rPr>
-                <w:lang w:val="en-US"/>
-              </w:rPr>
-              <w:t>/items}</w:t>
+            <w:proofErr w:type="spellStart"/>
+            <w:r>
+              <w:rPr>
+                <w:lang w:val="uk-UA"/>
+              </w:rPr>
+              <w:t>act-job-item-total-price</w:t>
+            </w:r>
+            <w:proofErr w:type="spellEnd"/>
+            <w:r>
+              <w:rPr>
+                <w:lang w:val="uk-UA"/>
+              </w:rPr>
+              <w:t>}</w:t>
+            </w:r>
+            <w:r>
+              <w:rPr>
+                <w:lang w:val="uk-UA"/>
+              </w:rPr>
+              <w:t>{/</w:t>
+            </w:r>
+            <w:proofErr w:type="spellStart"/>
+            <w:r>
+              <w:rPr>
+                <w:lang w:val="uk-UA"/>
+              </w:rPr>
+              <w:t>items</w:t>
+            </w:r>
+            <w:proofErr w:type="spellEnd"/>
+            <w:r>
+              <w:rPr>
+                <w:lang w:val="uk-UA"/>
+              </w:rPr>
+              <w:t>}</w:t>
             </w:r>
           </w:p>
         </w:tc>
@@ -1168,23 +1022,33 @@
               <w:rPr>
                 <w:b/>
                 <w:bCs/>
-                <w:lang w:val="en-US"/>
-              </w:rPr>
-              <w:t>{act-jobs-price-</w:t>
-            </w:r>
-            <w:r>
-              <w:rPr>
-                <w:b/>
-                <w:bCs/>
-                <w:lang w:val="en-US"/>
+                <w:lang w:val="uk-UA"/>
+              </w:rPr>
+              <w:t>{</w:t>
+            </w:r>
+            <w:proofErr w:type="spellStart"/>
+            <w:r>
+              <w:rPr>
+                <w:b/>
+                <w:bCs/>
+                <w:lang w:val="uk-UA"/>
+              </w:rPr>
+              <w:t>act-jobs-price-</w:t>
+            </w:r>
+            <w:r>
+              <w:rPr>
+                <w:b/>
+                <w:bCs/>
+                <w:lang w:val="uk-UA"/>
               </w:rPr>
               <w:t>without-tax</w:t>
             </w:r>
-            <w:r>
-              <w:rPr>
-                <w:b/>
-                <w:bCs/>
-                <w:lang w:val="en-US"/>
+            <w:proofErr w:type="spellEnd"/>
+            <w:r>
+              <w:rPr>
+                <w:b/>
+                <w:bCs/>
+                <w:lang w:val="uk-UA"/>
               </w:rPr>
               <w:t>}</w:t>
             </w:r>
@@ -1242,23 +1106,25 @@
               <w:rPr>
                 <w:b/>
                 <w:bCs/>
-                <w:lang w:val="en-US"/>
-              </w:rPr>
-              <w:t>{act-jobs-</w:t>
-            </w:r>
-            <w:r>
-              <w:rPr>
-                <w:b/>
-                <w:bCs/>
-                <w:lang w:val="en-US"/>
-              </w:rPr>
-              <w:t>tax</w:t>
-            </w:r>
-            <w:r>
-              <w:rPr>
-                <w:b/>
-                <w:bCs/>
-                <w:lang w:val="en-US"/>
+                <w:lang w:val="uk-UA"/>
+              </w:rPr>
+              <w:t>{</w:t>
+            </w:r>
+            <w:proofErr w:type="spellStart"/>
+            <w:r>
+              <w:rPr>
+                <w:b/>
+                <w:bCs/>
+                <w:lang w:val="uk-UA"/>
+              </w:rPr>
+              <w:t>act-jobs-tax</w:t>
+            </w:r>
+            <w:proofErr w:type="spellEnd"/>
+            <w:r>
+              <w:rPr>
+                <w:b/>
+                <w:bCs/>
+                <w:lang w:val="uk-UA"/>
               </w:rPr>
               <w:t>}</w:t>
             </w:r>
@@ -1316,23 +1182,25 @@
               <w:rPr>
                 <w:b/>
                 <w:bCs/>
-                <w:lang w:val="en-US"/>
-              </w:rPr>
-              <w:t>{act-jobs-price-</w:t>
-            </w:r>
-            <w:r>
-              <w:rPr>
-                <w:b/>
-                <w:bCs/>
-                <w:lang w:val="en-US"/>
-              </w:rPr>
-              <w:t>with-tax</w:t>
-            </w:r>
-            <w:r>
-              <w:rPr>
-                <w:b/>
-                <w:bCs/>
-                <w:lang w:val="en-US"/>
+                <w:lang w:val="uk-UA"/>
+              </w:rPr>
+              <w:t>{</w:t>
+            </w:r>
+            <w:proofErr w:type="spellStart"/>
+            <w:r>
+              <w:rPr>
+                <w:b/>
+                <w:bCs/>
+                <w:lang w:val="uk-UA"/>
+              </w:rPr>
+              <w:t>act-jobs-price-with-tax</w:t>
+            </w:r>
+            <w:proofErr w:type="spellEnd"/>
+            <w:r>
+              <w:rPr>
+                <w:b/>
+                <w:bCs/>
+                <w:lang w:val="uk-UA"/>
               </w:rPr>
               <w:t>}</w:t>
             </w:r>
@@ -1377,13 +1245,7 @@
         <w:rPr>
           <w:lang w:val="uk-UA"/>
         </w:rPr>
-        <w:t>, с</w:t>
-      </w:r>
-      <w:r>
-        <w:rPr>
-          <w:lang w:val="uk-UA"/>
-        </w:rPr>
-        <w:t>кладає</w:t>
+        <w:t>, складає</w:t>
       </w:r>
       <w:r>
         <w:rPr>
@@ -1401,46 +1263,16 @@
         </w:rPr>
         <w:t>{</w:t>
       </w:r>
-      <w:r>
-        <w:rPr>
-          <w:b/>
-          <w:bCs/>
-          <w:lang w:val="en-US"/>
-        </w:rPr>
-        <w:t>act</w:t>
-      </w:r>
-      <w:r>
-        <w:rPr>
-          <w:b/>
-          <w:bCs/>
-          <w:lang w:val="uk-UA"/>
-        </w:rPr>
-        <w:t>-</w:t>
-      </w:r>
-      <w:r>
-        <w:rPr>
-          <w:b/>
-          <w:bCs/>
-          <w:lang w:val="en-US"/>
-        </w:rPr>
-        <w:t>price</w:t>
-      </w:r>
-      <w:r>
-        <w:rPr>
-          <w:b/>
-          <w:bCs/>
-          <w:lang w:val="uk-UA"/>
-        </w:rPr>
-        <w:t>-</w:t>
-      </w:r>
-      <w:r>
-        <w:rPr>
-          <w:b/>
-          <w:bCs/>
-          <w:lang w:val="en-US"/>
-        </w:rPr>
-        <w:t>literal</w:t>
-      </w:r>
+      <w:proofErr w:type="spellStart"/>
+      <w:r>
+        <w:rPr>
+          <w:b/>
+          <w:bCs/>
+          <w:lang w:val="uk-UA"/>
+        </w:rPr>
+        <w:t>act-price-literal</w:t>
+      </w:r>
+      <w:proofErr w:type="spellEnd"/>
       <w:r>
         <w:rPr>
           <w:b/>
@@ -1476,25 +1308,13 @@
         <w:rPr>
           <w:lang w:val="uk-UA"/>
         </w:rPr>
-        <w:t>в по</w:t>
-      </w:r>
-      <w:r>
-        <w:rPr>
-          <w:lang w:val="uk-UA"/>
-        </w:rPr>
-        <w:t xml:space="preserve">вному </w:t>
-      </w:r>
-      <w:r>
-        <w:rPr>
-          <w:lang w:val="uk-UA"/>
-        </w:rPr>
-        <w:t>об</w:t>
-      </w:r>
-      <w:r>
-        <w:rPr>
-          <w:lang w:val="uk-UA"/>
-        </w:rPr>
-        <w:t>сязі</w:t>
+        <w:t>в повному обсязі та необхідної якості у відповідності</w:t>
+      </w:r>
+      <w:r>
+        <w:rPr>
+          <w:lang w:val="uk-UA"/>
+        </w:rPr>
+        <w:t xml:space="preserve"> з</w:t>
       </w:r>
       <w:r>
         <w:rPr>
@@ -1504,21 +1324,29 @@
       </w:r>
       <w:r>
         <w:rPr>
-          <w:lang w:val="uk-UA"/>
-        </w:rPr>
-        <w:t xml:space="preserve">та </w:t>
-      </w:r>
-      <w:r>
-        <w:rPr>
-          <w:lang w:val="uk-UA"/>
-        </w:rPr>
-        <w:t>необх</w:t>
-      </w:r>
-      <w:r>
-        <w:rPr>
-          <w:lang w:val="uk-UA"/>
-        </w:rPr>
-        <w:t>ідної якості</w:t>
+          <w:b/>
+          <w:bCs/>
+          <w:lang w:val="uk-UA"/>
+        </w:rPr>
+        <w:t>{</w:t>
+      </w:r>
+      <w:proofErr w:type="spellStart"/>
+      <w:r>
+        <w:rPr>
+          <w:b/>
+          <w:bCs/>
+          <w:lang w:val="uk-UA"/>
+        </w:rPr>
+        <w:t>act-treaty</w:t>
+      </w:r>
+      <w:proofErr w:type="spellEnd"/>
+      <w:r>
+        <w:rPr>
+          <w:b/>
+          <w:bCs/>
+          <w:lang w:val="uk-UA"/>
+        </w:rPr>
+        <w:t>}</w:t>
       </w:r>
       <w:r>
         <w:rPr>
@@ -1528,106 +1356,22 @@
       </w:r>
       <w:r>
         <w:rPr>
-          <w:lang w:val="uk-UA"/>
-        </w:rPr>
-        <w:t>у</w:t>
-      </w:r>
-      <w:r>
-        <w:rPr>
-          <w:lang w:val="uk-UA"/>
-        </w:rPr>
-        <w:t xml:space="preserve"> </w:t>
-      </w:r>
-      <w:r>
-        <w:rPr>
-          <w:lang w:val="uk-UA"/>
-        </w:rPr>
-        <w:t>відповідності</w:t>
-      </w:r>
-      <w:r>
-        <w:rPr>
-          <w:lang w:val="uk-UA"/>
-        </w:rPr>
-        <w:t xml:space="preserve"> з</w:t>
-      </w:r>
-      <w:r>
-        <w:rPr>
-          <w:lang w:val="uk-UA"/>
-        </w:rPr>
-        <w:t xml:space="preserve"> {</w:t>
-      </w:r>
-      <w:r>
-        <w:rPr>
-          <w:lang w:val="en-US"/>
-        </w:rPr>
-        <w:t>act</w:t>
-      </w:r>
-      <w:r>
-        <w:rPr>
-          <w:lang w:val="uk-UA"/>
-        </w:rPr>
-        <w:t>-</w:t>
-      </w:r>
-      <w:r>
-        <w:rPr>
-          <w:lang w:val="en-US"/>
-        </w:rPr>
-        <w:t>treaty</w:t>
-      </w:r>
-      <w:r>
-        <w:rPr>
-          <w:lang w:val="uk-UA"/>
-        </w:rPr>
-        <w:t xml:space="preserve">} </w:t>
-      </w:r>
-      <w:r>
-        <w:rPr>
           <w:b/>
           <w:bCs/>
           <w:lang w:val="uk-UA"/>
         </w:rPr>
         <w:t>№{</w:t>
       </w:r>
-      <w:r>
-        <w:rPr>
-          <w:b/>
-          <w:bCs/>
-          <w:lang w:val="en-US"/>
-        </w:rPr>
-        <w:t>act</w:t>
-      </w:r>
-      <w:r>
-        <w:rPr>
-          <w:b/>
-          <w:bCs/>
-          <w:lang w:val="uk-UA"/>
-        </w:rPr>
-        <w:t>-</w:t>
-      </w:r>
-      <w:r>
-        <w:rPr>
-          <w:b/>
-          <w:bCs/>
-          <w:lang w:val="en-US"/>
-        </w:rPr>
-        <w:t>treaty</w:t>
-      </w:r>
-      <w:r>
-        <w:rPr>
-          <w:b/>
-          <w:bCs/>
-          <w:lang w:val="uk-UA"/>
-        </w:rPr>
-        <w:t>-</w:t>
-      </w:r>
-      <w:r>
-        <w:rPr>
-          <w:b/>
-          <w:bCs/>
-          <w:lang w:val="en-US"/>
-        </w:rPr>
-        <w:t>number</w:t>
-      </w:r>
+      <w:proofErr w:type="spellStart"/>
+      <w:r>
+        <w:rPr>
+          <w:b/>
+          <w:bCs/>
+          <w:lang w:val="uk-UA"/>
+        </w:rPr>
+        <w:t>act-treaty-number</w:t>
+      </w:r>
+      <w:proofErr w:type="spellEnd"/>
       <w:r>
         <w:rPr>
           <w:b/>
@@ -1640,13 +1384,7 @@
         <w:rPr>
           <w:lang w:val="uk-UA"/>
         </w:rPr>
-        <w:t xml:space="preserve"> від</w:t>
-      </w:r>
-      <w:r>
-        <w:rPr>
-          <w:lang w:val="uk-UA"/>
-        </w:rPr>
-        <w:t xml:space="preserve"> </w:t>
+        <w:t xml:space="preserve"> від </w:t>
       </w:r>
       <w:r>
         <w:rPr>
@@ -1656,46 +1394,16 @@
         </w:rPr>
         <w:t>{</w:t>
       </w:r>
-      <w:r>
-        <w:rPr>
-          <w:b/>
-          <w:bCs/>
-          <w:lang w:val="en-US"/>
-        </w:rPr>
-        <w:t>act</w:t>
-      </w:r>
-      <w:r>
-        <w:rPr>
-          <w:b/>
-          <w:bCs/>
-          <w:lang w:val="uk-UA"/>
-        </w:rPr>
-        <w:t>-</w:t>
-      </w:r>
-      <w:r>
-        <w:rPr>
-          <w:b/>
-          <w:bCs/>
-          <w:lang w:val="en-US"/>
-        </w:rPr>
-        <w:t>treaty</w:t>
-      </w:r>
-      <w:r>
-        <w:rPr>
-          <w:b/>
-          <w:bCs/>
-          <w:lang w:val="uk-UA"/>
-        </w:rPr>
-        <w:t>-</w:t>
-      </w:r>
-      <w:r>
-        <w:rPr>
-          <w:b/>
-          <w:bCs/>
-          <w:lang w:val="en-US"/>
-        </w:rPr>
-        <w:t>date</w:t>
-      </w:r>
+      <w:proofErr w:type="spellStart"/>
+      <w:r>
+        <w:rPr>
+          <w:b/>
+          <w:bCs/>
+          <w:lang w:val="uk-UA"/>
+        </w:rPr>
+        <w:t>act-treaty-date</w:t>
+      </w:r>
+      <w:proofErr w:type="spellEnd"/>
       <w:r>
         <w:rPr>
           <w:b/>
@@ -1719,31 +1427,7 @@
         <w:rPr>
           <w:lang w:val="uk-UA"/>
         </w:rPr>
-        <w:t>Претенз</w:t>
-      </w:r>
-      <w:r>
-        <w:rPr>
-          <w:lang w:val="uk-UA"/>
-        </w:rPr>
-        <w:t>і</w:t>
-      </w:r>
-      <w:r>
-        <w:rPr>
-          <w:lang w:val="uk-UA"/>
-        </w:rPr>
-        <w:t xml:space="preserve">й </w:t>
-      </w:r>
-      <w:r>
-        <w:rPr>
-          <w:lang w:val="uk-UA"/>
-        </w:rPr>
-        <w:t>до</w:t>
-      </w:r>
-      <w:r>
-        <w:rPr>
-          <w:lang w:val="uk-UA"/>
-        </w:rPr>
-        <w:t xml:space="preserve"> </w:t>
+        <w:t xml:space="preserve">Претензій до </w:t>
       </w:r>
       <w:r>
         <w:rPr>
@@ -1756,31 +1440,7 @@
         <w:rPr>
           <w:lang w:val="uk-UA"/>
         </w:rPr>
-        <w:t xml:space="preserve"> </w:t>
-      </w:r>
-      <w:r>
-        <w:rPr>
-          <w:lang w:val="uk-UA"/>
-        </w:rPr>
-        <w:t>з</w:t>
-      </w:r>
-      <w:r>
-        <w:rPr>
-          <w:lang w:val="uk-UA"/>
-        </w:rPr>
-        <w:t xml:space="preserve"> </w:t>
-      </w:r>
-      <w:r>
-        <w:rPr>
-          <w:lang w:val="uk-UA"/>
-        </w:rPr>
-        <w:t>боку</w:t>
-      </w:r>
-      <w:r>
-        <w:rPr>
-          <w:lang w:val="uk-UA"/>
-        </w:rPr>
-        <w:t xml:space="preserve"> </w:t>
+        <w:t xml:space="preserve"> з боку </w:t>
       </w:r>
       <w:r>
         <w:rPr>
@@ -1793,13 +1453,7 @@
         <w:rPr>
           <w:lang w:val="uk-UA"/>
         </w:rPr>
-        <w:t xml:space="preserve"> </w:t>
-      </w:r>
-      <w:r>
-        <w:rPr>
-          <w:lang w:val="uk-UA"/>
-        </w:rPr>
-        <w:t>немає</w:t>
+        <w:t xml:space="preserve"> немає</w:t>
       </w:r>
       <w:r>
         <w:rPr>
@@ -1870,27 +1524,36 @@
               <w:jc w:val="center"/>
               <w:rPr>
                 <w:b/>
-                <w:lang w:val="en-US" w:eastAsia="uk-UA"/>
-              </w:rPr>
-            </w:pPr>
-            <w:r>
-              <w:rPr>
-                <w:b/>
-                <w:lang w:val="en-US" w:eastAsia="uk-UA"/>
-              </w:rPr>
-              <w:t>{act-sign-</w:t>
-            </w:r>
-            <w:r>
-              <w:rPr>
-                <w:b/>
-                <w:lang w:val="en-US" w:eastAsia="uk-UA"/>
+                <w:lang w:val="uk-UA" w:eastAsia="uk-UA"/>
+              </w:rPr>
+            </w:pPr>
+            <w:r>
+              <w:rPr>
+                <w:b/>
+                <w:lang w:val="uk-UA" w:eastAsia="uk-UA"/>
+              </w:rPr>
+              <w:t>{</w:t>
+            </w:r>
+            <w:proofErr w:type="spellStart"/>
+            <w:r>
+              <w:rPr>
+                <w:b/>
+                <w:lang w:val="uk-UA" w:eastAsia="uk-UA"/>
+              </w:rPr>
+              <w:t>act-sign-</w:t>
+            </w:r>
+            <w:r>
+              <w:rPr>
+                <w:b/>
+                <w:lang w:val="uk-UA" w:eastAsia="uk-UA"/>
               </w:rPr>
               <w:t>contractor</w:t>
             </w:r>
-            <w:r>
-              <w:rPr>
-                <w:b/>
-                <w:lang w:val="en-US" w:eastAsia="uk-UA"/>
+            <w:proofErr w:type="spellEnd"/>
+            <w:r>
+              <w:rPr>
+                <w:b/>
+                <w:lang w:val="uk-UA" w:eastAsia="uk-UA"/>
               </w:rPr>
               <w:t>}</w:t>
             </w:r>
@@ -1925,7 +1588,7 @@
               <w:jc w:val="center"/>
               <w:rPr>
                 <w:b/>
-                <w:lang w:val="en-US" w:eastAsia="uk-UA"/>
+                <w:lang w:val="uk-UA" w:eastAsia="uk-UA"/>
               </w:rPr>
             </w:pPr>
             <w:bookmarkStart w:id="19" w:name="FirmNamePl"/>
@@ -1937,15 +1600,31 @@
               <w:jc w:val="center"/>
               <w:rPr>
                 <w:b/>
-                <w:lang w:val="en-US" w:eastAsia="uk-UA"/>
-              </w:rPr>
-            </w:pPr>
-            <w:r>
-              <w:rPr>
-                <w:b/>
-                <w:lang w:val="en-US" w:eastAsia="uk-UA"/>
-              </w:rPr>
-              <w:t>{act-sign-customer}</w:t>
+                <w:lang w:val="uk-UA" w:eastAsia="uk-UA"/>
+              </w:rPr>
+            </w:pPr>
+            <w:r>
+              <w:rPr>
+                <w:b/>
+                <w:lang w:val="uk-UA" w:eastAsia="uk-UA"/>
+              </w:rPr>
+              <w:t>{</w:t>
+            </w:r>
+            <w:proofErr w:type="spellStart"/>
+            <w:r>
+              <w:rPr>
+                <w:b/>
+                <w:lang w:val="uk-UA" w:eastAsia="uk-UA"/>
+              </w:rPr>
+              <w:t>act-sign-customer</w:t>
+            </w:r>
+            <w:proofErr w:type="spellEnd"/>
+            <w:r>
+              <w:rPr>
+                <w:b/>
+                <w:lang w:val="uk-UA" w:eastAsia="uk-UA"/>
+              </w:rPr>
+              <w:t>}</w:t>
             </w:r>
           </w:p>
         </w:tc>
@@ -1978,23 +1657,39 @@
             <w:r>
               <w:rPr>
                 <w:b/>
-                <w:lang w:val="en-US" w:eastAsia="uk-UA"/>
-              </w:rPr>
-              <w:t>{act-sign-</w:t>
-            </w:r>
-            <w:r>
-              <w:rPr>
-                <w:b/>
-                <w:lang w:val="en-US" w:eastAsia="uk-UA"/>
+                <w:lang w:val="uk-UA" w:eastAsia="uk-UA"/>
+              </w:rPr>
+              <w:t>{</w:t>
+            </w:r>
+            <w:proofErr w:type="spellStart"/>
+            <w:r>
+              <w:rPr>
+                <w:b/>
+                <w:lang w:val="uk-UA" w:eastAsia="uk-UA"/>
+              </w:rPr>
+              <w:t>act-sign-</w:t>
+            </w:r>
+            <w:r>
+              <w:rPr>
+                <w:b/>
+                <w:lang w:val="uk-UA" w:eastAsia="uk-UA"/>
               </w:rPr>
               <w:t>contractor</w:t>
             </w:r>
             <w:r>
               <w:rPr>
                 <w:b/>
-                <w:lang w:val="en-US" w:eastAsia="uk-UA"/>
-              </w:rPr>
-              <w:t>-position}</w:t>
+                <w:lang w:val="uk-UA" w:eastAsia="uk-UA"/>
+              </w:rPr>
+              <w:t>-position</w:t>
+            </w:r>
+            <w:proofErr w:type="spellEnd"/>
+            <w:r>
+              <w:rPr>
+                <w:b/>
+                <w:lang w:val="uk-UA" w:eastAsia="uk-UA"/>
+              </w:rPr>
+              <w:t>}</w:t>
             </w:r>
           </w:p>
           <w:p>
@@ -2027,23 +1722,39 @@
             <w:r>
               <w:rPr>
                 <w:b/>
-                <w:lang w:val="en-US" w:eastAsia="uk-UA"/>
-              </w:rPr>
-              <w:t>{act-sign-</w:t>
-            </w:r>
-            <w:r>
-              <w:rPr>
-                <w:b/>
-                <w:lang w:val="en-US" w:eastAsia="uk-UA"/>
+                <w:lang w:val="uk-UA" w:eastAsia="uk-UA"/>
+              </w:rPr>
+              <w:t>{</w:t>
+            </w:r>
+            <w:proofErr w:type="spellStart"/>
+            <w:r>
+              <w:rPr>
+                <w:b/>
+                <w:lang w:val="uk-UA" w:eastAsia="uk-UA"/>
+              </w:rPr>
+              <w:t>act-sign-</w:t>
+            </w:r>
+            <w:r>
+              <w:rPr>
+                <w:b/>
+                <w:lang w:val="uk-UA" w:eastAsia="uk-UA"/>
               </w:rPr>
               <w:t>contractor</w:t>
             </w:r>
             <w:r>
               <w:rPr>
                 <w:b/>
-                <w:lang w:val="en-US" w:eastAsia="uk-UA"/>
-              </w:rPr>
-              <w:t>-person}</w:t>
+                <w:lang w:val="uk-UA" w:eastAsia="uk-UA"/>
+              </w:rPr>
+              <w:t>-person</w:t>
+            </w:r>
+            <w:proofErr w:type="spellEnd"/>
+            <w:r>
+              <w:rPr>
+                <w:b/>
+                <w:lang w:val="uk-UA" w:eastAsia="uk-UA"/>
+              </w:rPr>
+              <w:t>}</w:t>
             </w:r>
           </w:p>
           <w:p>
@@ -2071,7 +1782,7 @@
                 <w:bCs/>
                 <w:sz w:val="20"/>
                 <w:szCs w:val="20"/>
-                <w:lang w:val="en-US" w:eastAsia="uk-UA"/>
+                <w:lang w:val="uk-UA" w:eastAsia="uk-UA"/>
               </w:rPr>
               <w:t>(</w:t>
             </w:r>
@@ -2089,7 +1800,7 @@
                 <w:bCs/>
                 <w:sz w:val="20"/>
                 <w:szCs w:val="20"/>
-                <w:lang w:val="en-US" w:eastAsia="uk-UA"/>
+                <w:lang w:val="uk-UA" w:eastAsia="uk-UA"/>
               </w:rPr>
               <w:t>)</w:t>
             </w:r>
@@ -2122,9 +1833,25 @@
             <w:r>
               <w:rPr>
                 <w:b/>
-                <w:lang w:val="en-US" w:eastAsia="uk-UA"/>
-              </w:rPr>
-              <w:t>{act-sign-customer-position}</w:t>
+                <w:lang w:val="uk-UA" w:eastAsia="uk-UA"/>
+              </w:rPr>
+              <w:t>{</w:t>
+            </w:r>
+            <w:proofErr w:type="spellStart"/>
+            <w:r>
+              <w:rPr>
+                <w:b/>
+                <w:lang w:val="uk-UA" w:eastAsia="uk-UA"/>
+              </w:rPr>
+              <w:t>act-sign-customer-position</w:t>
+            </w:r>
+            <w:proofErr w:type="spellEnd"/>
+            <w:r>
+              <w:rPr>
+                <w:b/>
+                <w:lang w:val="uk-UA" w:eastAsia="uk-UA"/>
+              </w:rPr>
+              <w:t>}</w:t>
             </w:r>
           </w:p>
           <w:p>
@@ -2157,9 +1884,25 @@
             <w:r>
               <w:rPr>
                 <w:b/>
-                <w:lang w:val="en-US" w:eastAsia="uk-UA"/>
-              </w:rPr>
-              <w:t>{act-sign-customer-person}</w:t>
+                <w:lang w:val="uk-UA" w:eastAsia="uk-UA"/>
+              </w:rPr>
+              <w:t>{</w:t>
+            </w:r>
+            <w:proofErr w:type="spellStart"/>
+            <w:r>
+              <w:rPr>
+                <w:b/>
+                <w:lang w:val="uk-UA" w:eastAsia="uk-UA"/>
+              </w:rPr>
+              <w:t>act-sign-customer-person</w:t>
+            </w:r>
+            <w:proofErr w:type="spellEnd"/>
+            <w:r>
+              <w:rPr>
+                <w:b/>
+                <w:lang w:val="uk-UA" w:eastAsia="uk-UA"/>
+              </w:rPr>
+              <w:t>}</w:t>
             </w:r>
           </w:p>
           <w:p>
@@ -2180,7 +1923,7 @@
                 <w:bCs/>
                 <w:sz w:val="20"/>
                 <w:szCs w:val="20"/>
-                <w:lang w:val="en-US" w:eastAsia="uk-UA"/>
+                <w:lang w:val="uk-UA" w:eastAsia="uk-UA"/>
               </w:rPr>
             </w:pPr>
             <w:r>
@@ -2188,27 +1931,9 @@
                 <w:bCs/>
                 <w:sz w:val="20"/>
                 <w:szCs w:val="20"/>
-                <w:lang w:val="en-US" w:eastAsia="uk-UA"/>
-              </w:rPr>
-              <w:t>(</w:t>
-            </w:r>
-            <w:r>
-              <w:rPr>
-                <w:bCs/>
-                <w:sz w:val="20"/>
-                <w:szCs w:val="20"/>
-                <w:lang w:val="uk-UA" w:eastAsia="uk-UA"/>
-              </w:rPr>
-              <w:t>М.П.</w:t>
-            </w:r>
-            <w:r>
-              <w:rPr>
-                <w:bCs/>
-                <w:sz w:val="20"/>
-                <w:szCs w:val="20"/>
-                <w:lang w:val="en-US" w:eastAsia="uk-UA"/>
-              </w:rPr>
-              <w:t>)</w:t>
+                <w:lang w:val="uk-UA" w:eastAsia="uk-UA"/>
+              </w:rPr>
+              <w:t>(М.П.)</w:t>
             </w:r>
           </w:p>
         </w:tc>

</xml_diff>

<commit_message>
Update acceptance act and work document templates, add favicon, and enhance layout
- Modified the acceptance act and work document templates to improve formatting and readability by adding spaces in the text.
- Introduced a new favicon for the application to enhance branding and user experience.
- Updated the layout metadata to reflect the new application title and description.
- Enhanced global CSS styles for better visual consistency across the application.
- Added functionality to generate analogue contracts and invoices, improving document management capabilities.
</commit_message>
<xml_diff>
--- a/forms/act-service.docx
+++ b/forms/act-service.docx
@@ -385,6 +385,12 @@
           <w:lang w:val="uk-UA"/>
         </w:rPr>
         <w:t>з</w:t>
+      </w:r>
+      <w:r>
+        <w:rPr>
+          <w:lang w:val="uk-UA"/>
+        </w:rPr>
+        <w:t xml:space="preserve"> </w:t>
       </w:r>
       <w:r>
         <w:rPr>

</xml_diff>